<commit_message>
Simplify URL source add flow, batch link add, and refresh v1 docs
- Add URL dialog: drop signed-in audience option and crawl-depth/max-pages
  selects in favor of a single "single page vs multiple pages" choice
- Internal Knowledge Links dialog: support adding multiple links at once
- Add AI-13 (website crawl/page discovery) user story, cross-referenced
  with BE-15's ingestion pipeline under Epic 6, and regenerate v1 docs
- Ignore Word lock files (~$*.docx/.xlsx) going forward

Co-Authored-By: Claude Sonnet 5 <noreply@anthropic.com>
</commit_message>
<xml_diff>
--- a/docs/v1/Mercury_V1_User_Stories_AI_Engineer.docx
+++ b/docs/v1/Mercury_V1_User_Stories_AI_Engineer.docx
@@ -56,7 +56,7 @@
           <w:color w:val="777777"/>
           <w:sz w:val="20"/>
         </w:rPr>
-        <w:t>Story count: 12</w:t>
+        <w:t>Story count: 13</w:t>
       </w:r>
     </w:p>
     <w:p>
@@ -1291,6 +1291,149 @@
       </w:pPr>
       <w:r>
         <w:t>A retrain triggered while a previous indexing job for the same source is still running is queued or rejected, never run concurrently against the same source</w:t>
+      </w:r>
+    </w:p>
+    <w:p/>
+    <w:p>
+      <w:pPr>
+        <w:pStyle w:val="Heading2"/>
+      </w:pPr>
+      <w:r>
+        <w:rPr>
+          <w:color w:val="1B5E20"/>
+        </w:rPr>
+        <w:t>AI-13 — Website crawl: page discovery and per-page source creation</w:t>
+      </w:r>
+    </w:p>
+    <w:p>
+      <w:r>
+        <w:rPr>
+          <w:i w:val="0"/>
+        </w:rPr>
+        <w:t xml:space="preserve">As a </w:t>
+      </w:r>
+      <w:r>
+        <w:rPr>
+          <w:b/>
+        </w:rPr>
+        <w:t>bot-training system</w:t>
+      </w:r>
+      <w:r>
+        <w:t xml:space="preserve">, I want to </w:t>
+      </w:r>
+      <w:r>
+        <w:rPr>
+          <w:b/>
+        </w:rPr>
+        <w:t>a submitted website URL to be crawled — discovering individual pages up to a chosen depth and page limit</w:t>
+      </w:r>
+      <w:r>
+        <w:t xml:space="preserve">, so that </w:t>
+      </w:r>
+      <w:r>
+        <w:rPr>
+          <w:b/>
+        </w:rPr>
+        <w:t>admins can review real, specific pages and choose exactly which ones become trainable sources, instead of blindly training on an entire site</w:t>
+      </w:r>
+      <w:r>
+        <w:t>.</w:t>
+      </w:r>
+    </w:p>
+    <w:p>
+      <w:pPr>
+        <w:pStyle w:val="IntenseQuote"/>
+      </w:pPr>
+      <w:r>
+        <w:t>Acceptance Criteria:</w:t>
+      </w:r>
+    </w:p>
+    <w:p>
+      <w:pPr>
+        <w:pStyle w:val="ListBullet"/>
+      </w:pPr>
+      <w:r>
+        <w:t>Builds on BE-15's discovery contract (Epic 6 — Knowledge &amp; Canned Content): BE-15 owns crawling, the discovery scan, and the status pipeline; this story owns turning each discovered page into an accurate title/path/content preview an admin can judge</w:t>
+      </w:r>
+    </w:p>
+    <w:p>
+      <w:pPr>
+        <w:pStyle w:val="ListBullet"/>
+      </w:pPr>
+      <w:r>
+        <w:t>Submitting a URL with a crawl depth (1/2/3 levels deep) and a max-page cap (10/25/50/100) starts a real crawl that discovers pages progressively, each with a title, path, and short content preview — not a single bulk result</w:t>
+      </w:r>
+    </w:p>
+    <w:p>
+      <w:pPr>
+        <w:pStyle w:val="ListBullet"/>
+      </w:pPr>
+      <w:r>
+        <w:t>Depth and max-pages combine correctly as hard caps: a 1-level-deep crawl never returns more pages than that depth could reach, even if the page cap is higher</w:t>
+      </w:r>
+    </w:p>
+    <w:p>
+      <w:pPr>
+        <w:pStyle w:val="ListBullet"/>
+      </w:pPr>
+      <w:r>
+        <w:t>Each page the admin selects from the discovered list becomes its own independent trainable source (one page = one source) and enters the same status pipeline as AI-06 (queued -&gt; indexing -&gt; indexed/failed)</w:t>
+      </w:r>
+    </w:p>
+    <w:p>
+      <w:pPr>
+        <w:pStyle w:val="ListBullet"/>
+      </w:pPr>
+      <w:r>
+        <w:t>A page's source name defaults to that page's own title; an optional source-name prefix, if provided, is applied consistently to every page added from that scan</w:t>
+      </w:r>
+    </w:p>
+    <w:p>
+      <w:pPr>
+        <w:pStyle w:val="ListBullet"/>
+      </w:pPr>
+      <w:r>
+        <w:t>The audience setting (Anyone / Signed-in customers) chosen once for the scan applies to every page created from it</w:t>
+      </w:r>
+    </w:p>
+    <w:p>
+      <w:pPr>
+        <w:pStyle w:val="IntenseQuote"/>
+      </w:pPr>
+      <w:r>
+        <w:t>Edge Cases:</w:t>
+      </w:r>
+    </w:p>
+    <w:p>
+      <w:pPr>
+        <w:pStyle w:val="ListBullet"/>
+      </w:pPr>
+      <w:r>
+        <w:t>A discovered page the crawler can't access (e.g. sign-in required) is not silently dropped — it is still listed, marked failed with a specific reason (e.g. '401 Unauthorized'), and visible to the admin</w:t>
+      </w:r>
+    </w:p>
+    <w:p>
+      <w:pPr>
+        <w:pStyle w:val="ListBullet"/>
+      </w:pPr>
+      <w:r>
+        <w:t>Re-running 'Rescan' against the same URL/depth/max-pages returns a consistent, repeatable set of pages, not a different random result each time</w:t>
+      </w:r>
+    </w:p>
+    <w:p>
+      <w:pPr>
+        <w:pStyle w:val="ListBullet"/>
+      </w:pPr>
+      <w:r>
+        <w:t>A page deselected before submitting is never created as a source at all (not created-then-disabled)</w:t>
+      </w:r>
+    </w:p>
+    <w:p>
+      <w:pPr>
+        <w:pStyle w:val="ListBullet"/>
+      </w:pPr>
+      <w:r>
+        <w:t>A page whose content changes after being added is picked up correctly by the existing retrain flow (AI-12) — the crawl origin doesn't create a separate update path</w:t>
       </w:r>
     </w:p>
     <w:p/>

</xml_diff>